<commit_message>
MD-11 and 717: CO RTE
</commit_message>
<xml_diff>
--- a/717/FMS_and_MCDU.docx
+++ b/717/FMS_and_MCDU.docx
@@ -98,7 +98,7 @@
           <w:sz w:val="24"/>
           <w:szCs w:val="24"/>
         </w:rPr>
-        <w:t>7/16/2025</w:t>
+        <w:t>4/7/2026</w:t>
       </w:r>
       <w:r>
         <w:rPr>
@@ -7048,31 +7048,23 @@
     </w:p>
     <w:p>
       <w:r>
-        <w:t xml:space="preserve">A stored Company Route can be </w:t>
-      </w:r>
-      <w:r>
-        <w:t>entered</w:t>
-      </w:r>
-      <w:r>
-        <w:t xml:space="preserve"> into </w:t>
-      </w:r>
-      <w:r>
-        <w:t>f</w:t>
-      </w:r>
-      <w:r>
-        <w:t xml:space="preserve">ield </w:t>
-      </w:r>
-      <w:r>
-        <w:t>1L</w:t>
-      </w:r>
-      <w:r>
-        <w:t>. This feature will be used to allow external flight</w:t>
-      </w:r>
-      <w:r>
-        <w:t xml:space="preserve"> </w:t>
-      </w:r>
-      <w:r>
-        <w:t>plan files to be loaded in a future version of the aircraft.</w:t>
+        <w:t>A stored Company Route can be entered into field 1L. This allows you to load .</w:t>
+      </w:r>
+      <w:proofErr w:type="spellStart"/>
+      <w:r>
+        <w:t>gpx</w:t>
+      </w:r>
+      <w:proofErr w:type="spellEnd"/>
+      <w:r>
+        <w:t xml:space="preserve"> or .</w:t>
+      </w:r>
+      <w:proofErr w:type="spellStart"/>
+      <w:r>
+        <w:t>fgfp</w:t>
+      </w:r>
+      <w:proofErr w:type="spellEnd"/>
+      <w:r>
+        <w:t xml:space="preserve"> files placed $FG_HOME/Export. Enter the filename without the extension to load it. Note that this feature is not complete.</w:t>
       </w:r>
     </w:p>
     <w:p>

</xml_diff>